<commit_message>
Clean up formatting in API specification document
</commit_message>
<xml_diff>
--- a/documents/API-specification.docx
+++ b/documents/API-specification.docx
@@ -360,19 +360,7 @@
               <w:rPr>
                 <w:sz w:val="18"/>
               </w:rPr>
-              <w:t xml:space="preserve"> + created user summary </w:t>
-            </w:r>
-            <w:r>
-              <w:rPr>
-                <w:sz w:val="18"/>
-              </w:rPr>
-              <w:t>/</w:t>
-            </w:r>
-            <w:r>
-              <w:rPr>
-                <w:sz w:val="18"/>
-              </w:rPr>
-              <w:t>400, 409</w:t>
+              <w:t xml:space="preserve"> + created user summary /400, 409</w:t>
             </w:r>
           </w:p>
         </w:tc>
@@ -548,14 +536,7 @@
                 <w:rFonts w:ascii="Consolas" w:hAnsi="Consolas"/>
                 <w:sz w:val="17"/>
               </w:rPr>
-              <w:t xml:space="preserve"> </w:t>
-            </w:r>
-            <w:r>
-              <w:rPr>
-                <w:rFonts w:ascii="Consolas" w:hAnsi="Consolas"/>
-                <w:sz w:val="17"/>
-              </w:rPr>
-              <w:t>/</w:t>
+              <w:t xml:space="preserve"> /</w:t>
             </w:r>
             <w:r>
               <w:rPr>
@@ -742,14 +723,7 @@
                 <w:rFonts w:ascii="Consolas" w:hAnsi="Consolas"/>
                 <w:sz w:val="17"/>
               </w:rPr>
-              <w:t xml:space="preserve"> </w:t>
-            </w:r>
-            <w:r>
-              <w:rPr>
-                <w:rFonts w:ascii="Consolas" w:hAnsi="Consolas"/>
-                <w:sz w:val="17"/>
-              </w:rPr>
-              <w:t>/</w:t>
+              <w:t xml:space="preserve"> /</w:t>
             </w:r>
             <w:r>
               <w:rPr>
@@ -988,19 +962,7 @@
               <w:rPr>
                 <w:sz w:val="18"/>
               </w:rPr>
-              <w:t xml:space="preserve"> + user profile </w:t>
-            </w:r>
-            <w:r>
-              <w:rPr>
-                <w:sz w:val="18"/>
-              </w:rPr>
-              <w:t>/</w:t>
-            </w:r>
-            <w:r>
-              <w:rPr>
-                <w:sz w:val="18"/>
-              </w:rPr>
-              <w:t>401</w:t>
+              <w:t xml:space="preserve"> + user profile /401</w:t>
             </w:r>
           </w:p>
         </w:tc>
@@ -1320,19 +1282,7 @@
               <w:rPr>
                 <w:sz w:val="18"/>
               </w:rPr>
-              <w:t xml:space="preserve"> + user profile</w:t>
-            </w:r>
-            <w:r>
-              <w:rPr>
-                <w:sz w:val="18"/>
-              </w:rPr>
-              <w:t>/</w:t>
-            </w:r>
-            <w:r>
-              <w:rPr>
-                <w:sz w:val="18"/>
-              </w:rPr>
-              <w:t xml:space="preserve"> 401, 403, 404</w:t>
+              <w:t xml:space="preserve"> + user profile/ 401, 403, 404</w:t>
             </w:r>
           </w:p>
         </w:tc>
@@ -1485,14 +1435,7 @@
                 <w:rFonts w:ascii="Consolas" w:hAnsi="Consolas"/>
                 <w:sz w:val="17"/>
               </w:rPr>
-              <w:t xml:space="preserve"> </w:t>
-            </w:r>
-            <w:r>
-              <w:rPr>
-                <w:rFonts w:ascii="Consolas" w:hAnsi="Consolas"/>
-                <w:sz w:val="17"/>
-              </w:rPr>
-              <w:t>/</w:t>
+              <w:t xml:space="preserve"> /</w:t>
             </w:r>
             <w:r>
               <w:rPr>
@@ -1624,24 +1567,16 @@
               <w:rPr>
                 <w:sz w:val="18"/>
               </w:rPr>
-              <w:t xml:space="preserve"> + updated role list </w:t>
-            </w:r>
-            <w:r>
-              <w:rPr>
-                <w:sz w:val="18"/>
-              </w:rPr>
-              <w:t>/</w:t>
-            </w:r>
-            <w:r>
-              <w:rPr>
-                <w:sz w:val="18"/>
-              </w:rPr>
-              <w:t>400, 401, 403, 404</w:t>
+              <w:t xml:space="preserve"> + updated role list /400, 401, 403, 404</w:t>
             </w:r>
           </w:p>
         </w:tc>
       </w:tr>
     </w:tbl>
+    <w:p/>
+    <w:p/>
+    <w:p/>
+    <w:p/>
     <w:p/>
     <w:p>
       <w:pPr>
@@ -1657,6 +1592,7 @@
           <w:bCs/>
           <w:color w:val="156082" w:themeColor="accent1"/>
         </w:rPr>
+        <w:lastRenderedPageBreak/>
         <w:t>Clubs</w:t>
       </w:r>
     </w:p>
@@ -1899,7 +1835,6 @@
               <w:rPr>
                 <w:sz w:val="18"/>
               </w:rPr>
-              <w:lastRenderedPageBreak/>
               <w:t>GET</w:t>
             </w:r>
           </w:p>
@@ -1998,19 +1933,7 @@
               <w:rPr>
                 <w:sz w:val="18"/>
               </w:rPr>
-              <w:t xml:space="preserve"> + club </w:t>
-            </w:r>
-            <w:r>
-              <w:rPr>
-                <w:sz w:val="18"/>
-              </w:rPr>
-              <w:t>/</w:t>
-            </w:r>
-            <w:r>
-              <w:rPr>
-                <w:sz w:val="18"/>
-              </w:rPr>
-              <w:t>404</w:t>
+              <w:t xml:space="preserve"> + club /404</w:t>
             </w:r>
           </w:p>
         </w:tc>
@@ -2168,19 +2091,7 @@
               <w:rPr>
                 <w:sz w:val="18"/>
               </w:rPr>
-              <w:t xml:space="preserve"> + created club </w:t>
-            </w:r>
-            <w:r>
-              <w:rPr>
-                <w:sz w:val="18"/>
-              </w:rPr>
-              <w:t>/</w:t>
-            </w:r>
-            <w:r>
-              <w:rPr>
-                <w:sz w:val="18"/>
-              </w:rPr>
-              <w:t xml:space="preserve"> 400, 401, 403</w:t>
+              <w:t xml:space="preserve"> + created club / 400, 401, 403</w:t>
             </w:r>
           </w:p>
         </w:tc>
@@ -2335,19 +2246,7 @@
               <w:rPr>
                 <w:sz w:val="18"/>
               </w:rPr>
-              <w:t xml:space="preserve"> + updated club </w:t>
-            </w:r>
-            <w:r>
-              <w:rPr>
-                <w:sz w:val="18"/>
-              </w:rPr>
-              <w:t>/</w:t>
-            </w:r>
-            <w:r>
-              <w:rPr>
-                <w:sz w:val="18"/>
-              </w:rPr>
-              <w:t>400, 401, 403, 404</w:t>
+              <w:t xml:space="preserve"> + updated club /400, 401, 403, 404</w:t>
             </w:r>
           </w:p>
         </w:tc>
@@ -2464,19 +2363,7 @@
               <w:rPr>
                 <w:sz w:val="18"/>
               </w:rPr>
-              <w:t xml:space="preserve"> </w:t>
-            </w:r>
-            <w:r>
-              <w:rPr>
-                <w:sz w:val="18"/>
-              </w:rPr>
-              <w:t xml:space="preserve">/ </w:t>
-            </w:r>
-            <w:r>
-              <w:rPr>
-                <w:sz w:val="18"/>
-              </w:rPr>
-              <w:t>401, 403, 404, 409</w:t>
+              <w:t xml:space="preserve"> / 401, 403, 404, 409</w:t>
             </w:r>
           </w:p>
         </w:tc>
@@ -3173,19 +3060,7 @@
               <w:rPr>
                 <w:sz w:val="18"/>
               </w:rPr>
-              <w:t xml:space="preserve"> + updated venue </w:t>
-            </w:r>
-            <w:r>
-              <w:rPr>
-                <w:sz w:val="18"/>
-              </w:rPr>
-              <w:t>/</w:t>
-            </w:r>
-            <w:r>
-              <w:rPr>
-                <w:sz w:val="18"/>
-              </w:rPr>
-              <w:t xml:space="preserve"> 400, 401, 403, 404</w:t>
+              <w:t xml:space="preserve"> + updated venue / 400, 401, 403, 404</w:t>
             </w:r>
           </w:p>
         </w:tc>
@@ -3302,19 +3177,7 @@
               <w:rPr>
                 <w:sz w:val="18"/>
               </w:rPr>
-              <w:t xml:space="preserve"> </w:t>
-            </w:r>
-            <w:r>
-              <w:rPr>
-                <w:sz w:val="18"/>
-              </w:rPr>
-              <w:t>/</w:t>
-            </w:r>
-            <w:r>
-              <w:rPr>
-                <w:sz w:val="18"/>
-              </w:rPr>
-              <w:t xml:space="preserve"> 401, 403, 404, 409</w:t>
+              <w:t xml:space="preserve"> / 401, 403, 404, 409</w:t>
             </w:r>
           </w:p>
         </w:tc>
@@ -3505,6 +3368,42 @@
       </w:tr>
     </w:tbl>
     <w:p/>
+    <w:p>
+      <w:pPr>
+        <w:rPr>
+          <w:b/>
+          <w:bCs/>
+          <w:color w:val="156082" w:themeColor="accent1"/>
+        </w:rPr>
+      </w:pPr>
+    </w:p>
+    <w:p>
+      <w:pPr>
+        <w:rPr>
+          <w:b/>
+          <w:bCs/>
+          <w:color w:val="156082" w:themeColor="accent1"/>
+        </w:rPr>
+      </w:pPr>
+    </w:p>
+    <w:p>
+      <w:pPr>
+        <w:rPr>
+          <w:b/>
+          <w:bCs/>
+          <w:color w:val="156082" w:themeColor="accent1"/>
+        </w:rPr>
+      </w:pPr>
+    </w:p>
+    <w:p>
+      <w:pPr>
+        <w:rPr>
+          <w:b/>
+          <w:bCs/>
+          <w:color w:val="156082" w:themeColor="accent1"/>
+        </w:rPr>
+      </w:pPr>
+    </w:p>
     <w:p>
       <w:pPr>
         <w:rPr>
@@ -3519,6 +3418,7 @@
           <w:bCs/>
           <w:color w:val="156082" w:themeColor="accent1"/>
         </w:rPr>
+        <w:lastRenderedPageBreak/>
         <w:t>Routes</w:t>
       </w:r>
     </w:p>
@@ -3533,8 +3433,8 @@
         <w:gridCol w:w="1008"/>
         <w:gridCol w:w="2880"/>
         <w:gridCol w:w="1417"/>
-        <w:gridCol w:w="1103"/>
-        <w:gridCol w:w="2250"/>
+        <w:gridCol w:w="1170"/>
+        <w:gridCol w:w="2183"/>
         <w:gridCol w:w="1237"/>
       </w:tblGrid>
       <w:tr>
@@ -3580,7 +3480,7 @@
         </w:tc>
         <w:tc>
           <w:tcPr>
-            <w:tcW w:w="1103" w:type="dxa"/>
+            <w:tcW w:w="1170" w:type="dxa"/>
           </w:tcPr>
           <w:p>
             <w:pPr>
@@ -3593,7 +3493,7 @@
         </w:tc>
         <w:tc>
           <w:tcPr>
-            <w:tcW w:w="2250" w:type="dxa"/>
+            <w:tcW w:w="2183" w:type="dxa"/>
           </w:tcPr>
           <w:p>
             <w:pPr>
@@ -3703,7 +3603,7 @@
         </w:tc>
         <w:tc>
           <w:tcPr>
-            <w:tcW w:w="1103" w:type="dxa"/>
+            <w:tcW w:w="1170" w:type="dxa"/>
           </w:tcPr>
           <w:p>
             <w:pPr>
@@ -3719,7 +3619,7 @@
         </w:tc>
         <w:tc>
           <w:tcPr>
-            <w:tcW w:w="2250" w:type="dxa"/>
+            <w:tcW w:w="2183" w:type="dxa"/>
           </w:tcPr>
           <w:p>
             <w:pPr>
@@ -3845,7 +3745,7 @@
         </w:tc>
         <w:tc>
           <w:tcPr>
-            <w:tcW w:w="1103" w:type="dxa"/>
+            <w:tcW w:w="1170" w:type="dxa"/>
           </w:tcPr>
           <w:p>
             <w:pPr>
@@ -3861,7 +3761,7 @@
         </w:tc>
         <w:tc>
           <w:tcPr>
-            <w:tcW w:w="2250" w:type="dxa"/>
+            <w:tcW w:w="2183" w:type="dxa"/>
           </w:tcPr>
           <w:p>
             <w:pPr>
@@ -3999,7 +3899,6 @@
               <w:rPr>
                 <w:sz w:val="18"/>
               </w:rPr>
-              <w:lastRenderedPageBreak/>
               <w:t>GET</w:t>
             </w:r>
           </w:p>
@@ -4055,7 +3954,7 @@
         </w:tc>
         <w:tc>
           <w:tcPr>
-            <w:tcW w:w="1103" w:type="dxa"/>
+            <w:tcW w:w="1170" w:type="dxa"/>
           </w:tcPr>
           <w:p>
             <w:pPr>
@@ -4071,7 +3970,7 @@
         </w:tc>
         <w:tc>
           <w:tcPr>
-            <w:tcW w:w="2250" w:type="dxa"/>
+            <w:tcW w:w="2183" w:type="dxa"/>
           </w:tcPr>
           <w:p>
             <w:pPr>
@@ -4098,19 +3997,7 @@
               <w:rPr>
                 <w:sz w:val="18"/>
               </w:rPr>
-              <w:t xml:space="preserve"> + route </w:t>
-            </w:r>
-            <w:r>
-              <w:rPr>
-                <w:sz w:val="18"/>
-              </w:rPr>
-              <w:t>/</w:t>
-            </w:r>
-            <w:r>
-              <w:rPr>
-                <w:sz w:val="18"/>
-              </w:rPr>
-              <w:t>404</w:t>
+              <w:t xml:space="preserve"> + route /404</w:t>
             </w:r>
           </w:p>
         </w:tc>
@@ -4181,7 +4068,7 @@
         </w:tc>
         <w:tc>
           <w:tcPr>
-            <w:tcW w:w="1103" w:type="dxa"/>
+            <w:tcW w:w="1170" w:type="dxa"/>
           </w:tcPr>
           <w:p>
             <w:pPr>
@@ -4197,7 +4084,7 @@
         </w:tc>
         <w:tc>
           <w:tcPr>
-            <w:tcW w:w="2250" w:type="dxa"/>
+            <w:tcW w:w="2183" w:type="dxa"/>
           </w:tcPr>
           <w:p>
             <w:pPr>
@@ -4304,19 +4191,7 @@
               <w:rPr>
                 <w:sz w:val="18"/>
               </w:rPr>
-              <w:t xml:space="preserve"> + updated route </w:t>
-            </w:r>
-            <w:r>
-              <w:rPr>
-                <w:sz w:val="18"/>
-              </w:rPr>
-              <w:t>/</w:t>
-            </w:r>
-            <w:r>
-              <w:rPr>
-                <w:sz w:val="18"/>
-              </w:rPr>
-              <w:t>400, 401, 403, 404</w:t>
+              <w:t xml:space="preserve"> + updated route /400, 401, 403, 404</w:t>
             </w:r>
           </w:p>
         </w:tc>
@@ -4390,7 +4265,7 @@
         </w:tc>
         <w:tc>
           <w:tcPr>
-            <w:tcW w:w="1103" w:type="dxa"/>
+            <w:tcW w:w="1170" w:type="dxa"/>
           </w:tcPr>
           <w:p>
             <w:pPr>
@@ -4406,7 +4281,7 @@
         </w:tc>
         <w:tc>
           <w:tcPr>
-            <w:tcW w:w="2250" w:type="dxa"/>
+            <w:tcW w:w="2183" w:type="dxa"/>
           </w:tcPr>
           <w:p>
             <w:pPr>
@@ -4433,19 +4308,7 @@
               <w:rPr>
                 <w:sz w:val="18"/>
               </w:rPr>
-              <w:t xml:space="preserve"> </w:t>
-            </w:r>
-            <w:r>
-              <w:rPr>
-                <w:sz w:val="18"/>
-              </w:rPr>
-              <w:t>/</w:t>
-            </w:r>
-            <w:r>
-              <w:rPr>
-                <w:sz w:val="18"/>
-              </w:rPr>
-              <w:t>401, 403, 404</w:t>
+              <w:t xml:space="preserve"> /401, 403, 404</w:t>
             </w:r>
           </w:p>
         </w:tc>
@@ -4791,19 +4654,7 @@
               <w:rPr>
                 <w:sz w:val="18"/>
               </w:rPr>
-              <w:t xml:space="preserve"> + event</w:t>
-            </w:r>
-            <w:r>
-              <w:rPr>
-                <w:sz w:val="18"/>
-              </w:rPr>
-              <w:t xml:space="preserve"> /</w:t>
-            </w:r>
-            <w:r>
-              <w:rPr>
-                <w:sz w:val="18"/>
-              </w:rPr>
-              <w:t xml:space="preserve"> 404</w:t>
+              <w:t xml:space="preserve"> + event / 404</w:t>
             </w:r>
           </w:p>
         </w:tc>
@@ -4929,14 +4780,7 @@
                 <w:rFonts w:ascii="Consolas" w:hAnsi="Consolas"/>
                 <w:sz w:val="17"/>
               </w:rPr>
-              <w:t>, description, discipline,</w:t>
-            </w:r>
-            <w:r>
-              <w:rPr>
-                <w:rFonts w:ascii="Consolas" w:hAnsi="Consolas"/>
-                <w:sz w:val="17"/>
-              </w:rPr>
-              <w:t xml:space="preserve"> </w:t>
+              <w:t xml:space="preserve">, description, discipline, </w:t>
             </w:r>
             <w:proofErr w:type="spellStart"/>
             <w:r>
@@ -5032,19 +4876,7 @@
               <w:rPr>
                 <w:sz w:val="18"/>
               </w:rPr>
-              <w:t xml:space="preserve"> + created event </w:t>
-            </w:r>
-            <w:r>
-              <w:rPr>
-                <w:sz w:val="18"/>
-              </w:rPr>
-              <w:t>/</w:t>
-            </w:r>
-            <w:r>
-              <w:rPr>
-                <w:sz w:val="18"/>
-              </w:rPr>
-              <w:t>400, 401, 403</w:t>
+              <w:t xml:space="preserve"> + created event /400, 401, 403</w:t>
             </w:r>
           </w:p>
         </w:tc>
@@ -5167,14 +4999,7 @@
                 <w:rFonts w:ascii="Consolas" w:hAnsi="Consolas"/>
                 <w:sz w:val="17"/>
               </w:rPr>
-              <w:t>, description, discipline,</w:t>
-            </w:r>
-            <w:r>
-              <w:rPr>
-                <w:rFonts w:ascii="Consolas" w:hAnsi="Consolas"/>
-                <w:sz w:val="17"/>
-              </w:rPr>
-              <w:t xml:space="preserve"> </w:t>
+              <w:t xml:space="preserve">, description, discipline, </w:t>
             </w:r>
             <w:proofErr w:type="spellStart"/>
             <w:r>
@@ -5254,19 +5079,7 @@
               <w:rPr>
                 <w:sz w:val="18"/>
               </w:rPr>
-              <w:t xml:space="preserve"> + updated event </w:t>
-            </w:r>
-            <w:r>
-              <w:rPr>
-                <w:sz w:val="18"/>
-              </w:rPr>
-              <w:t>/</w:t>
-            </w:r>
-            <w:r>
-              <w:rPr>
-                <w:sz w:val="18"/>
-              </w:rPr>
-              <w:t>400, 401, 403, 404</w:t>
+              <w:t xml:space="preserve"> + updated event /400, 401, 403, 404</w:t>
             </w:r>
           </w:p>
         </w:tc>
@@ -5350,13 +5163,7 @@
               <w:rPr>
                 <w:sz w:val="18"/>
               </w:rPr>
-              <w:t>Organizer (owner)/Admi</w:t>
-            </w:r>
-            <w:r>
-              <w:rPr>
-                <w:sz w:val="18"/>
-              </w:rPr>
-              <w:t>n</w:t>
+              <w:t>Organizer (owner)/Admin</w:t>
             </w:r>
           </w:p>
         </w:tc>
@@ -5389,19 +5196,7 @@
               <w:rPr>
                 <w:sz w:val="18"/>
               </w:rPr>
-              <w:t xml:space="preserve"> </w:t>
-            </w:r>
-            <w:r>
-              <w:rPr>
-                <w:sz w:val="18"/>
-              </w:rPr>
-              <w:t>/</w:t>
-            </w:r>
-            <w:r>
-              <w:rPr>
-                <w:sz w:val="18"/>
-              </w:rPr>
-              <w:t>401, 403, 404, 409</w:t>
+              <w:t xml:space="preserve"> /401, 403, 404, 409</w:t>
             </w:r>
           </w:p>
         </w:tc>
@@ -5664,20 +5459,14 @@
                 <w:rFonts w:ascii="Consolas" w:hAnsi="Consolas"/>
                 <w:sz w:val="17"/>
               </w:rPr>
-              <w:t>temperature, condition</w:t>
-            </w:r>
-            <w:r>
-              <w:rPr>
-                <w:rFonts w:ascii="Consolas" w:hAnsi="Consolas"/>
-                <w:sz w:val="17"/>
-              </w:rPr>
-              <w:t>s</w:t>
-            </w:r>
-            <w:r>
-              <w:rPr>
-                <w:rFonts w:ascii="Consolas" w:hAnsi="Consolas"/>
-                <w:sz w:val="17"/>
-              </w:rPr>
+              <w:t>temperature, conditions</w:t>
+            </w:r>
+            <w:r>
+              <w:rPr>
+                <w:rFonts w:ascii="Consolas" w:hAnsi="Consolas"/>
+                <w:sz w:val="17"/>
+              </w:rPr>
+              <w:lastRenderedPageBreak/>
               <w:t xml:space="preserve">, </w:t>
             </w:r>
             <w:proofErr w:type="spellStart"/>
@@ -5710,14 +5499,7 @@
                 <w:rFonts w:ascii="Consolas" w:hAnsi="Consolas"/>
                 <w:sz w:val="17"/>
               </w:rPr>
-              <w:t xml:space="preserve"> </w:t>
-            </w:r>
-            <w:r>
-              <w:rPr>
-                <w:rFonts w:ascii="Consolas" w:hAnsi="Consolas"/>
-                <w:sz w:val="17"/>
-              </w:rPr>
-              <w:t>/</w:t>
+              <w:t xml:space="preserve"> /</w:t>
             </w:r>
             <w:r>
               <w:rPr>
@@ -5729,8 +5511,6 @@
         </w:tc>
       </w:tr>
     </w:tbl>
-    <w:p/>
-    <w:p/>
     <w:p/>
     <w:p/>
     <w:p/>
@@ -5978,19 +5758,7 @@
               <w:rPr>
                 <w:sz w:val="18"/>
               </w:rPr>
-              <w:t xml:space="preserve"> + list </w:t>
-            </w:r>
-            <w:r>
-              <w:rPr>
-                <w:sz w:val="18"/>
-              </w:rPr>
-              <w:t>/</w:t>
-            </w:r>
-            <w:r>
-              <w:rPr>
-                <w:sz w:val="18"/>
-              </w:rPr>
-              <w:t>404</w:t>
+              <w:t xml:space="preserve"> + list /404</w:t>
             </w:r>
           </w:p>
         </w:tc>
@@ -6194,14 +5962,7 @@
                 <w:rFonts w:ascii="Consolas" w:hAnsi="Consolas"/>
                 <w:sz w:val="17"/>
               </w:rPr>
-              <w:t>,</w:t>
-            </w:r>
-            <w:r>
-              <w:rPr>
-                <w:rFonts w:ascii="Consolas" w:hAnsi="Consolas"/>
-                <w:sz w:val="17"/>
-              </w:rPr>
-              <w:t xml:space="preserve"> </w:t>
+              <w:t xml:space="preserve">, </w:t>
             </w:r>
             <w:proofErr w:type="spellStart"/>
             <w:r>
@@ -6233,19 +5994,7 @@
               <w:rPr>
                 <w:sz w:val="18"/>
               </w:rPr>
-              <w:t xml:space="preserve"> + created category </w:t>
-            </w:r>
-            <w:r>
-              <w:rPr>
-                <w:sz w:val="18"/>
-              </w:rPr>
-              <w:t>/</w:t>
-            </w:r>
-            <w:r>
-              <w:rPr>
-                <w:sz w:val="18"/>
-              </w:rPr>
-              <w:t>400, 401, 403, 404</w:t>
+              <w:t xml:space="preserve"> + created category /400, 401, 403, 404</w:t>
             </w:r>
           </w:p>
         </w:tc>
@@ -6363,19 +6112,7 @@
               <w:rPr>
                 <w:sz w:val="18"/>
               </w:rPr>
-              <w:t xml:space="preserve"> + category </w:t>
-            </w:r>
-            <w:r>
-              <w:rPr>
-                <w:sz w:val="18"/>
-              </w:rPr>
-              <w:t>/</w:t>
-            </w:r>
-            <w:r>
-              <w:rPr>
-                <w:sz w:val="18"/>
-              </w:rPr>
-              <w:t>404</w:t>
+              <w:t xml:space="preserve"> + category /404</w:t>
             </w:r>
           </w:p>
         </w:tc>
@@ -6579,19 +6316,7 @@
               <w:rPr>
                 <w:sz w:val="18"/>
               </w:rPr>
-              <w:t xml:space="preserve"> + updated category </w:t>
-            </w:r>
-            <w:r>
-              <w:rPr>
-                <w:sz w:val="18"/>
-              </w:rPr>
-              <w:t xml:space="preserve">/ </w:t>
-            </w:r>
-            <w:r>
-              <w:rPr>
-                <w:sz w:val="18"/>
-              </w:rPr>
-              <w:t>400, 401, 403, 404</w:t>
+              <w:t xml:space="preserve"> + updated category / 400, 401, 403, 404</w:t>
             </w:r>
           </w:p>
         </w:tc>
@@ -6709,19 +6434,7 @@
               <w:rPr>
                 <w:sz w:val="18"/>
               </w:rPr>
-              <w:t xml:space="preserve"> </w:t>
-            </w:r>
-            <w:r>
-              <w:rPr>
-                <w:sz w:val="18"/>
-              </w:rPr>
-              <w:t>/</w:t>
-            </w:r>
-            <w:r>
-              <w:rPr>
-                <w:sz w:val="18"/>
-              </w:rPr>
-              <w:t>401, 403, 404, 409</w:t>
+              <w:t xml:space="preserve"> /401, 403, 404, 409</w:t>
             </w:r>
           </w:p>
         </w:tc>
@@ -6969,19 +6682,7 @@
               <w:rPr>
                 <w:sz w:val="18"/>
               </w:rPr>
-              <w:t xml:space="preserve"> + created entry</w:t>
-            </w:r>
-            <w:r>
-              <w:rPr>
-                <w:sz w:val="18"/>
-              </w:rPr>
-              <w:t>/</w:t>
-            </w:r>
-            <w:r>
-              <w:rPr>
-                <w:sz w:val="18"/>
-              </w:rPr>
-              <w:t xml:space="preserve"> 400, 401, 404, 409</w:t>
+              <w:t xml:space="preserve"> + created entry/ 400, 401, 404, 409</w:t>
             </w:r>
           </w:p>
         </w:tc>
@@ -7095,19 +6796,7 @@
               <w:rPr>
                 <w:sz w:val="18"/>
               </w:rPr>
-              <w:t xml:space="preserve"> + list</w:t>
-            </w:r>
-            <w:r>
-              <w:rPr>
-                <w:sz w:val="18"/>
-              </w:rPr>
-              <w:t>/</w:t>
-            </w:r>
-            <w:r>
-              <w:rPr>
-                <w:sz w:val="18"/>
-              </w:rPr>
-              <w:t xml:space="preserve"> 401</w:t>
+              <w:t xml:space="preserve"> + list/ 401</w:t>
             </w:r>
           </w:p>
         </w:tc>
@@ -7240,19 +6929,7 @@
               <w:rPr>
                 <w:sz w:val="18"/>
               </w:rPr>
-              <w:t xml:space="preserve"> + paged list </w:t>
-            </w:r>
-            <w:r>
-              <w:rPr>
-                <w:sz w:val="18"/>
-              </w:rPr>
-              <w:t>/</w:t>
-            </w:r>
-            <w:r>
-              <w:rPr>
-                <w:sz w:val="18"/>
-              </w:rPr>
-              <w:t>401, 403, 404</w:t>
+              <w:t xml:space="preserve"> + paged list /401, 403, 404</w:t>
             </w:r>
           </w:p>
         </w:tc>
@@ -7366,19 +7043,7 @@
               <w:rPr>
                 <w:sz w:val="18"/>
               </w:rPr>
-              <w:t xml:space="preserve"> + entry </w:t>
-            </w:r>
-            <w:r>
-              <w:rPr>
-                <w:sz w:val="18"/>
-              </w:rPr>
-              <w:t>/</w:t>
-            </w:r>
-            <w:r>
-              <w:rPr>
-                <w:sz w:val="18"/>
-              </w:rPr>
-              <w:t>401, 403, 404</w:t>
+              <w:t xml:space="preserve"> + entry /401, 403, 404</w:t>
             </w:r>
           </w:p>
         </w:tc>
@@ -7495,19 +7160,7 @@
               <w:rPr>
                 <w:sz w:val="18"/>
               </w:rPr>
-              <w:t xml:space="preserve"> + updated entry </w:t>
-            </w:r>
-            <w:r>
-              <w:rPr>
-                <w:sz w:val="18"/>
-              </w:rPr>
-              <w:t>/</w:t>
-            </w:r>
-            <w:r>
-              <w:rPr>
-                <w:sz w:val="18"/>
-              </w:rPr>
-              <w:t>401, 403, 404, 409</w:t>
+              <w:t xml:space="preserve"> + updated entry /401, 403, 404, 409</w:t>
             </w:r>
           </w:p>
         </w:tc>
@@ -7630,30 +7283,12 @@
               <w:rPr>
                 <w:sz w:val="18"/>
               </w:rPr>
-              <w:t xml:space="preserve"> + updated entry</w:t>
-            </w:r>
-            <w:r>
-              <w:rPr>
-                <w:sz w:val="18"/>
-              </w:rPr>
-              <w:t>/</w:t>
-            </w:r>
-            <w:r>
-              <w:rPr>
-                <w:sz w:val="18"/>
-              </w:rPr>
-              <w:t xml:space="preserve"> 400, 401, 403, 404</w:t>
+              <w:t xml:space="preserve"> + updated entry/ 400, 401, 403, 404</w:t>
             </w:r>
           </w:p>
         </w:tc>
       </w:tr>
     </w:tbl>
-    <w:p/>
-    <w:p/>
-    <w:p/>
-    <w:p/>
-    <w:p/>
-    <w:p/>
     <w:p/>
     <w:p>
       <w:pPr>
@@ -7669,7 +7304,24 @@
           <w:bCs/>
           <w:color w:val="156082" w:themeColor="accent1"/>
         </w:rPr>
-        <w:t>Results</w:t>
+        <w:lastRenderedPageBreak/>
+        <w:t>R</w:t>
+      </w:r>
+      <w:r>
+        <w:rPr>
+          <w:b/>
+          <w:bCs/>
+          <w:color w:val="156082" w:themeColor="accent1"/>
+        </w:rPr>
+        <w:t>e</w:t>
+      </w:r>
+      <w:r>
+        <w:rPr>
+          <w:b/>
+          <w:bCs/>
+          <w:color w:val="156082" w:themeColor="accent1"/>
+        </w:rPr>
+        <w:t>sults</w:t>
       </w:r>
     </w:p>
     <w:tbl>
@@ -7953,19 +7605,7 @@
               <w:rPr>
                 <w:sz w:val="18"/>
               </w:rPr>
-              <w:t xml:space="preserve"> + created result </w:t>
-            </w:r>
-            <w:r>
-              <w:rPr>
-                <w:sz w:val="18"/>
-              </w:rPr>
-              <w:t>/</w:t>
-            </w:r>
-            <w:r>
-              <w:rPr>
-                <w:sz w:val="18"/>
-              </w:rPr>
-              <w:t>400, 401, 403, 404, 409</w:t>
+              <w:t xml:space="preserve"> + created result /400, 401, 403, 404, 409</w:t>
             </w:r>
           </w:p>
         </w:tc>
@@ -8095,19 +7735,7 @@
               <w:rPr>
                 <w:sz w:val="18"/>
               </w:rPr>
-              <w:t xml:space="preserve"> + paged list </w:t>
-            </w:r>
-            <w:r>
-              <w:rPr>
-                <w:sz w:val="18"/>
-              </w:rPr>
-              <w:t>/</w:t>
-            </w:r>
-            <w:r>
-              <w:rPr>
-                <w:sz w:val="18"/>
-              </w:rPr>
-              <w:t>404</w:t>
+              <w:t xml:space="preserve"> + paged list /404</w:t>
             </w:r>
           </w:p>
         </w:tc>
@@ -8240,19 +7868,7 @@
               <w:rPr>
                 <w:sz w:val="18"/>
               </w:rPr>
-              <w:t xml:space="preserve"> + list </w:t>
-            </w:r>
-            <w:r>
-              <w:rPr>
-                <w:sz w:val="18"/>
-              </w:rPr>
-              <w:t>/</w:t>
-            </w:r>
-            <w:r>
-              <w:rPr>
-                <w:sz w:val="18"/>
-              </w:rPr>
-              <w:t>404</w:t>
+              <w:t xml:space="preserve"> + list /404</w:t>
             </w:r>
           </w:p>
         </w:tc>
@@ -8366,19 +7982,7 @@
               <w:rPr>
                 <w:sz w:val="18"/>
               </w:rPr>
-              <w:t xml:space="preserve"> + result </w:t>
-            </w:r>
-            <w:r>
-              <w:rPr>
-                <w:sz w:val="18"/>
-              </w:rPr>
-              <w:t xml:space="preserve">/ </w:t>
-            </w:r>
-            <w:r>
-              <w:rPr>
-                <w:sz w:val="18"/>
-              </w:rPr>
-              <w:t>404</w:t>
+              <w:t xml:space="preserve"> + result / 404</w:t>
             </w:r>
           </w:p>
         </w:tc>
@@ -8552,19 +8156,7 @@
               <w:rPr>
                 <w:sz w:val="18"/>
               </w:rPr>
-              <w:t xml:space="preserve"> + updated result</w:t>
-            </w:r>
-            <w:r>
-              <w:rPr>
-                <w:sz w:val="18"/>
-              </w:rPr>
-              <w:t>/</w:t>
-            </w:r>
-            <w:r>
-              <w:rPr>
-                <w:sz w:val="18"/>
-              </w:rPr>
-              <w:t xml:space="preserve"> 400, 401, 403, 404</w:t>
+              <w:t xml:space="preserve"> + updated result/ 400, 401, 403, 404</w:t>
             </w:r>
           </w:p>
         </w:tc>
@@ -8678,19 +8270,7 @@
               <w:rPr>
                 <w:sz w:val="18"/>
               </w:rPr>
-              <w:t xml:space="preserve"> </w:t>
-            </w:r>
-            <w:r>
-              <w:rPr>
-                <w:sz w:val="18"/>
-              </w:rPr>
-              <w:t>/</w:t>
-            </w:r>
-            <w:r>
-              <w:rPr>
-                <w:sz w:val="18"/>
-              </w:rPr>
-              <w:t>401, 403, 404</w:t>
+              <w:t xml:space="preserve"> /401, 403, 404</w:t>
             </w:r>
           </w:p>
         </w:tc>
@@ -9310,6 +8890,7 @@
   <w:style w:type="character" w:default="1" w:styleId="DefaultParagraphFont">
     <w:name w:val="Default Paragraph Font"/>
     <w:uiPriority w:val="1"/>
+    <w:semiHidden/>
     <w:unhideWhenUsed/>
   </w:style>
   <w:style w:type="table" w:default="1" w:styleId="TableNormal">

</xml_diff>